<commit_message>
Gerar Ofícios - V0
</commit_message>
<xml_diff>
--- a/public/Modelo_Oficio_Placeholders.docx
+++ b/public/Modelo_Oficio_Placeholders.docx
@@ -28,7 +28,37 @@
         <w:rPr>
           <w:b/>
         </w:rPr>
-        <w:t>[[oficio_numero]]</w:t>
+        <w:t>[[</w:t>
+      </w:r>
+      <w:proofErr w:type="spellStart"/>
+      <w:proofErr w:type="gramStart"/>
+      <w:r>
+        <w:rPr>
+          <w:b/>
+        </w:rPr>
+        <w:t>oficio</w:t>
+      </w:r>
+      <w:proofErr w:type="gramEnd"/>
+      <w:r>
+        <w:rPr>
+          <w:b/>
+        </w:rPr>
+        <w:t>_</w:t>
+      </w:r>
+      <w:proofErr w:type="gramStart"/>
+      <w:r>
+        <w:rPr>
+          <w:b/>
+        </w:rPr>
+        <w:t>numero</w:t>
+      </w:r>
+      <w:proofErr w:type="spellEnd"/>
+      <w:proofErr w:type="gramEnd"/>
+      <w:r>
+        <w:rPr>
+          <w:b/>
+        </w:rPr>
+        <w:t>]]</w:t>
       </w:r>
     </w:p>
     <w:p>
@@ -70,7 +100,29 @@
         <w:rPr>
           <w:bCs/>
         </w:rPr>
-        <w:t>[[data_oficio]]</w:t>
+        <w:t>[[</w:t>
+      </w:r>
+      <w:proofErr w:type="spellStart"/>
+      <w:r>
+        <w:rPr>
+          <w:bCs/>
+        </w:rPr>
+        <w:t>data_</w:t>
+      </w:r>
+      <w:proofErr w:type="gramStart"/>
+      <w:r>
+        <w:rPr>
+          <w:bCs/>
+        </w:rPr>
+        <w:t>oficio</w:t>
+      </w:r>
+      <w:proofErr w:type="spellEnd"/>
+      <w:proofErr w:type="gramEnd"/>
+      <w:r>
+        <w:rPr>
+          <w:bCs/>
+        </w:rPr>
+        <w:t>]]</w:t>
       </w:r>
       <w:r>
         <w:rPr>
@@ -313,10 +365,20 @@
         <w:jc w:val="both"/>
       </w:pPr>
       <w:r>
-        <w:t>[[texto_oficio]]</w:t>
-      </w:r>
-      <w:r>
-        <w:t>.</w:t>
+        <w:t>[[</w:t>
+      </w:r>
+      <w:proofErr w:type="spellStart"/>
+      <w:r>
+        <w:t>texto_</w:t>
+      </w:r>
+      <w:proofErr w:type="gramStart"/>
+      <w:r>
+        <w:t>oficio</w:t>
+      </w:r>
+      <w:proofErr w:type="spellEnd"/>
+      <w:proofErr w:type="gramEnd"/>
+      <w:r>
+        <w:t>]]</w:t>
       </w:r>
     </w:p>
     <w:p>
@@ -3750,21 +3812,6 @@
 </file>
 
 <file path=customXml/item1.xml><?xml version="1.0" encoding="utf-8"?>
-<p:properties xmlns:p="http://schemas.microsoft.com/office/2006/metadata/properties" xmlns:xsi="http://www.w3.org/2001/XMLSchema-instance" xmlns:pc="http://schemas.microsoft.com/office/infopath/2007/PartnerControls">
-  <documentManagement/>
-</p:properties>
-</file>
-
-<file path=customXml/item2.xml><?xml version="1.0" encoding="utf-8"?>
-<?mso-contentType ?>
-<FormTemplates xmlns="http://schemas.microsoft.com/sharepoint/v3/contenttype/forms">
-  <Display>DocumentLibraryForm</Display>
-  <Edit>DocumentLibraryForm</Edit>
-  <New>DocumentLibraryForm</New>
-</FormTemplates>
-</file>
-
-<file path=customXml/item3.xml><?xml version="1.0" encoding="utf-8"?>
 <ct:contentTypeSchema xmlns:ct="http://schemas.microsoft.com/office/2006/metadata/contentType" xmlns:ma="http://schemas.microsoft.com/office/2006/metadata/properties/metaAttributes" ct:_="" ma:_="" ma:contentTypeName="Documento" ma:contentTypeID="0x010100CAE55CF73658E544A5BF877287E1080C" ma:contentTypeVersion="3" ma:contentTypeDescription="Crie um novo documento." ma:contentTypeScope="" ma:versionID="14a6e97193ba8b6e1df596bf8519ead2">
   <xsd:schema xmlns:xsd="http://www.w3.org/2001/XMLSchema" xmlns:xs="http://www.w3.org/2001/XMLSchema" xmlns:p="http://schemas.microsoft.com/office/2006/metadata/properties" xmlns:ns3="77306a16-23ae-4cbe-af75-532d7ab9970d" targetNamespace="http://schemas.microsoft.com/office/2006/metadata/properties" ma:root="true" ma:fieldsID="af44bec52caeb26cfb81bc62b69c3775" ns3:_="">
     <xsd:import namespace="77306a16-23ae-4cbe-af75-532d7ab9970d"/>
@@ -3902,24 +3949,22 @@
 </ct:contentTypeSchema>
 </file>
 
-<file path=customXml/itemProps1.xml><?xml version="1.0" encoding="utf-8"?>
-<ds:datastoreItem xmlns:ds="http://schemas.openxmlformats.org/officeDocument/2006/customXml" ds:itemID="{3A9EA4BE-E3B6-49A8-A8A7-D32E618C1B96}">
-  <ds:schemaRefs>
-    <ds:schemaRef ds:uri="http://schemas.microsoft.com/office/2006/metadata/properties"/>
-    <ds:schemaRef ds:uri="http://schemas.microsoft.com/office/infopath/2007/PartnerControls"/>
-  </ds:schemaRefs>
-</ds:datastoreItem>
+<file path=customXml/item2.xml><?xml version="1.0" encoding="utf-8"?>
+<?mso-contentType ?>
+<FormTemplates xmlns="http://schemas.microsoft.com/sharepoint/v3/contenttype/forms">
+  <Display>DocumentLibraryForm</Display>
+  <Edit>DocumentLibraryForm</Edit>
+  <New>DocumentLibraryForm</New>
+</FormTemplates>
 </file>
 
-<file path=customXml/itemProps2.xml><?xml version="1.0" encoding="utf-8"?>
-<ds:datastoreItem xmlns:ds="http://schemas.openxmlformats.org/officeDocument/2006/customXml" ds:itemID="{15487310-0DAD-4EC5-8B46-2B5D03BA84E1}">
-  <ds:schemaRefs>
-    <ds:schemaRef ds:uri="http://schemas.microsoft.com/sharepoint/v3/contenttype/forms"/>
-  </ds:schemaRefs>
-</ds:datastoreItem>
+<file path=customXml/item3.xml><?xml version="1.0" encoding="utf-8"?>
+<p:properties xmlns:p="http://schemas.microsoft.com/office/2006/metadata/properties" xmlns:xsi="http://www.w3.org/2001/XMLSchema-instance" xmlns:pc="http://schemas.microsoft.com/office/infopath/2007/PartnerControls">
+  <documentManagement/>
+</p:properties>
 </file>
 
-<file path=customXml/itemProps3.xml><?xml version="1.0" encoding="utf-8"?>
+<file path=customXml/itemProps1.xml><?xml version="1.0" encoding="utf-8"?>
 <ds:datastoreItem xmlns:ds="http://schemas.openxmlformats.org/officeDocument/2006/customXml" ds:itemID="{CBDD1861-660F-4DBF-A4C0-AAE9CE2B8071}">
   <ds:schemaRefs>
     <ds:schemaRef ds:uri="http://schemas.microsoft.com/office/2006/metadata/contentType"/>
@@ -3935,4 +3980,21 @@
     <ds:schemaRef ds:uri="http://schemas.microsoft.com/internal/obd"/>
   </ds:schemaRefs>
 </ds:datastoreItem>
+</file>
+
+<file path=customXml/itemProps2.xml><?xml version="1.0" encoding="utf-8"?>
+<ds:datastoreItem xmlns:ds="http://schemas.openxmlformats.org/officeDocument/2006/customXml" ds:itemID="{15487310-0DAD-4EC5-8B46-2B5D03BA84E1}">
+  <ds:schemaRefs>
+    <ds:schemaRef ds:uri="http://schemas.microsoft.com/sharepoint/v3/contenttype/forms"/>
+  </ds:schemaRefs>
+</ds:datastoreItem>
+</file>
+
+<file path=customXml/itemProps3.xml><?xml version="1.0" encoding="utf-8"?>
+<ds:datastoreItem xmlns:ds="http://schemas.openxmlformats.org/officeDocument/2006/customXml" ds:itemID="{3A9EA4BE-E3B6-49A8-A8A7-D32E618C1B96}">
+  <ds:schemaRefs>
+    <ds:schemaRef ds:uri="http://schemas.microsoft.com/office/2006/metadata/properties"/>
+    <ds:schemaRef ds:uri="http://schemas.microsoft.com/office/infopath/2007/PartnerControls"/>
+  </ds:schemaRefs>
+</ds:datastoreItem>
 </file>
</xml_diff>

<commit_message>
Ofícios - Versão beta
</commit_message>
<xml_diff>
--- a/public/Modelo_Oficio_Placeholders.docx
+++ b/public/Modelo_Oficio_Placeholders.docx
@@ -305,7 +305,7 @@
         <w:rPr>
           <w:bCs/>
         </w:rPr>
-        <w:t>50600.010068/2018-43</w:t>
+        <w:t>[[processo_sei]]</w:t>
       </w:r>
     </w:p>
     <w:p/>
@@ -3812,6 +3812,21 @@
 </file>
 
 <file path=customXml/item1.xml><?xml version="1.0" encoding="utf-8"?>
+<p:properties xmlns:p="http://schemas.microsoft.com/office/2006/metadata/properties" xmlns:xsi="http://www.w3.org/2001/XMLSchema-instance" xmlns:pc="http://schemas.microsoft.com/office/infopath/2007/PartnerControls">
+  <documentManagement/>
+</p:properties>
+</file>
+
+<file path=customXml/item2.xml><?xml version="1.0" encoding="utf-8"?>
+<?mso-contentType ?>
+<FormTemplates xmlns="http://schemas.microsoft.com/sharepoint/v3/contenttype/forms">
+  <Display>DocumentLibraryForm</Display>
+  <Edit>DocumentLibraryForm</Edit>
+  <New>DocumentLibraryForm</New>
+</FormTemplates>
+</file>
+
+<file path=customXml/item3.xml><?xml version="1.0" encoding="utf-8"?>
 <ct:contentTypeSchema xmlns:ct="http://schemas.microsoft.com/office/2006/metadata/contentType" xmlns:ma="http://schemas.microsoft.com/office/2006/metadata/properties/metaAttributes" ct:_="" ma:_="" ma:contentTypeName="Documento" ma:contentTypeID="0x010100CAE55CF73658E544A5BF877287E1080C" ma:contentTypeVersion="3" ma:contentTypeDescription="Crie um novo documento." ma:contentTypeScope="" ma:versionID="14a6e97193ba8b6e1df596bf8519ead2">
   <xsd:schema xmlns:xsd="http://www.w3.org/2001/XMLSchema" xmlns:xs="http://www.w3.org/2001/XMLSchema" xmlns:p="http://schemas.microsoft.com/office/2006/metadata/properties" xmlns:ns3="77306a16-23ae-4cbe-af75-532d7ab9970d" targetNamespace="http://schemas.microsoft.com/office/2006/metadata/properties" ma:root="true" ma:fieldsID="af44bec52caeb26cfb81bc62b69c3775" ns3:_="">
     <xsd:import namespace="77306a16-23ae-4cbe-af75-532d7ab9970d"/>
@@ -3949,22 +3964,24 @@
 </ct:contentTypeSchema>
 </file>
 
-<file path=customXml/item2.xml><?xml version="1.0" encoding="utf-8"?>
-<?mso-contentType ?>
-<FormTemplates xmlns="http://schemas.microsoft.com/sharepoint/v3/contenttype/forms">
-  <Display>DocumentLibraryForm</Display>
-  <Edit>DocumentLibraryForm</Edit>
-  <New>DocumentLibraryForm</New>
-</FormTemplates>
+<file path=customXml/itemProps1.xml><?xml version="1.0" encoding="utf-8"?>
+<ds:datastoreItem xmlns:ds="http://schemas.openxmlformats.org/officeDocument/2006/customXml" ds:itemID="{3A9EA4BE-E3B6-49A8-A8A7-D32E618C1B96}">
+  <ds:schemaRefs>
+    <ds:schemaRef ds:uri="http://schemas.microsoft.com/office/2006/metadata/properties"/>
+    <ds:schemaRef ds:uri="http://schemas.microsoft.com/office/infopath/2007/PartnerControls"/>
+  </ds:schemaRefs>
+</ds:datastoreItem>
 </file>
 
-<file path=customXml/item3.xml><?xml version="1.0" encoding="utf-8"?>
-<p:properties xmlns:p="http://schemas.microsoft.com/office/2006/metadata/properties" xmlns:xsi="http://www.w3.org/2001/XMLSchema-instance" xmlns:pc="http://schemas.microsoft.com/office/infopath/2007/PartnerControls">
-  <documentManagement/>
-</p:properties>
+<file path=customXml/itemProps2.xml><?xml version="1.0" encoding="utf-8"?>
+<ds:datastoreItem xmlns:ds="http://schemas.openxmlformats.org/officeDocument/2006/customXml" ds:itemID="{15487310-0DAD-4EC5-8B46-2B5D03BA84E1}">
+  <ds:schemaRefs>
+    <ds:schemaRef ds:uri="http://schemas.microsoft.com/sharepoint/v3/contenttype/forms"/>
+  </ds:schemaRefs>
+</ds:datastoreItem>
 </file>
 
-<file path=customXml/itemProps1.xml><?xml version="1.0" encoding="utf-8"?>
+<file path=customXml/itemProps3.xml><?xml version="1.0" encoding="utf-8"?>
 <ds:datastoreItem xmlns:ds="http://schemas.openxmlformats.org/officeDocument/2006/customXml" ds:itemID="{CBDD1861-660F-4DBF-A4C0-AAE9CE2B8071}">
   <ds:schemaRefs>
     <ds:schemaRef ds:uri="http://schemas.microsoft.com/office/2006/metadata/contentType"/>
@@ -3980,21 +3997,4 @@
     <ds:schemaRef ds:uri="http://schemas.microsoft.com/internal/obd"/>
   </ds:schemaRefs>
 </ds:datastoreItem>
-</file>
-
-<file path=customXml/itemProps2.xml><?xml version="1.0" encoding="utf-8"?>
-<ds:datastoreItem xmlns:ds="http://schemas.openxmlformats.org/officeDocument/2006/customXml" ds:itemID="{15487310-0DAD-4EC5-8B46-2B5D03BA84E1}">
-  <ds:schemaRefs>
-    <ds:schemaRef ds:uri="http://schemas.microsoft.com/sharepoint/v3/contenttype/forms"/>
-  </ds:schemaRefs>
-</ds:datastoreItem>
-</file>
-
-<file path=customXml/itemProps3.xml><?xml version="1.0" encoding="utf-8"?>
-<ds:datastoreItem xmlns:ds="http://schemas.openxmlformats.org/officeDocument/2006/customXml" ds:itemID="{3A9EA4BE-E3B6-49A8-A8A7-D32E618C1B96}">
-  <ds:schemaRefs>
-    <ds:schemaRef ds:uri="http://schemas.microsoft.com/office/2006/metadata/properties"/>
-    <ds:schemaRef ds:uri="http://schemas.microsoft.com/office/infopath/2007/PartnerControls"/>
-  </ds:schemaRefs>
-</ds:datastoreItem>
 </file>
</xml_diff>

<commit_message>
Ofícios - Modal de visualização
</commit_message>
<xml_diff>
--- a/public/Modelo_Oficio_Placeholders.docx
+++ b/public/Modelo_Oficio_Placeholders.docx
@@ -31,29 +31,13 @@
         <w:t>[[</w:t>
       </w:r>
       <w:proofErr w:type="spellStart"/>
-      <w:proofErr w:type="gramStart"/>
       <w:r>
         <w:rPr>
           <w:b/>
         </w:rPr>
-        <w:t>oficio</w:t>
-      </w:r>
-      <w:proofErr w:type="gramEnd"/>
-      <w:r>
-        <w:rPr>
-          <w:b/>
-        </w:rPr>
-        <w:t>_</w:t>
-      </w:r>
-      <w:proofErr w:type="gramStart"/>
-      <w:r>
-        <w:rPr>
-          <w:b/>
-        </w:rPr>
-        <w:t>numero</w:t>
+        <w:t>oficio_numero</w:t>
       </w:r>
       <w:proofErr w:type="spellEnd"/>
-      <w:proofErr w:type="gramEnd"/>
       <w:r>
         <w:rPr>
           <w:b/>
@@ -107,17 +91,9 @@
         <w:rPr>
           <w:bCs/>
         </w:rPr>
-        <w:t>data_</w:t>
-      </w:r>
-      <w:proofErr w:type="gramStart"/>
-      <w:r>
-        <w:rPr>
-          <w:bCs/>
-        </w:rPr>
-        <w:t>oficio</w:t>
+        <w:t>data_oficio</w:t>
       </w:r>
       <w:proofErr w:type="spellEnd"/>
-      <w:proofErr w:type="gramEnd"/>
       <w:r>
         <w:rPr>
           <w:bCs/>
@@ -275,7 +251,13 @@
         <w:t xml:space="preserve"> </w:t>
       </w:r>
       <w:r>
-        <w:t>[[assunto]]</w:t>
+        <w:t>[[</w:t>
+      </w:r>
+      <w:r>
+        <w:t>assunto</w:t>
+      </w:r>
+      <w:r>
+        <w:t>]]</w:t>
       </w:r>
     </w:p>
     <w:p>
@@ -305,7 +287,21 @@
         <w:rPr>
           <w:bCs/>
         </w:rPr>
-        <w:t>[[processo_sei]]</w:t>
+        <w:t>[[</w:t>
+      </w:r>
+      <w:proofErr w:type="spellStart"/>
+      <w:r>
+        <w:rPr>
+          <w:bCs/>
+        </w:rPr>
+        <w:t>processo_sei</w:t>
+      </w:r>
+      <w:proofErr w:type="spellEnd"/>
+      <w:r>
+        <w:rPr>
+          <w:bCs/>
+        </w:rPr>
+        <w:t>]]</w:t>
       </w:r>
     </w:p>
     <w:p/>
@@ -369,14 +365,9 @@
       </w:r>
       <w:proofErr w:type="spellStart"/>
       <w:r>
-        <w:t>texto_</w:t>
-      </w:r>
-      <w:proofErr w:type="gramStart"/>
-      <w:r>
-        <w:t>oficio</w:t>
+        <w:t>texto_oficio</w:t>
       </w:r>
       <w:proofErr w:type="spellEnd"/>
-      <w:proofErr w:type="gramEnd"/>
       <w:r>
         <w:t>]]</w:t>
       </w:r>

</xml_diff>

<commit_message>
Ofícios - Em Produção
</commit_message>
<xml_diff>
--- a/public/Modelo_Oficio_Placeholders.docx
+++ b/public/Modelo_Oficio_Placeholders.docx
@@ -31,13 +31,29 @@
         <w:t>[[</w:t>
       </w:r>
       <w:proofErr w:type="spellStart"/>
+      <w:proofErr w:type="gramStart"/>
       <w:r>
         <w:rPr>
           <w:b/>
         </w:rPr>
-        <w:t>oficio_numero</w:t>
+        <w:t>oficio</w:t>
+      </w:r>
+      <w:proofErr w:type="gramEnd"/>
+      <w:r>
+        <w:rPr>
+          <w:b/>
+        </w:rPr>
+        <w:t>_</w:t>
+      </w:r>
+      <w:proofErr w:type="gramStart"/>
+      <w:r>
+        <w:rPr>
+          <w:b/>
+        </w:rPr>
+        <w:t>numero</w:t>
       </w:r>
       <w:proofErr w:type="spellEnd"/>
+      <w:proofErr w:type="gramEnd"/>
       <w:r>
         <w:rPr>
           <w:b/>
@@ -91,9 +107,17 @@
         <w:rPr>
           <w:bCs/>
         </w:rPr>
-        <w:t>data_oficio</w:t>
+        <w:t>data_</w:t>
+      </w:r>
+      <w:proofErr w:type="gramStart"/>
+      <w:r>
+        <w:rPr>
+          <w:bCs/>
+        </w:rPr>
+        <w:t>oficio</w:t>
       </w:r>
       <w:proofErr w:type="spellEnd"/>
+      <w:proofErr w:type="gramEnd"/>
       <w:r>
         <w:rPr>
           <w:bCs/>
@@ -365,9 +389,14 @@
       </w:r>
       <w:proofErr w:type="spellStart"/>
       <w:r>
-        <w:t>texto_oficio</w:t>
+        <w:t>texto_</w:t>
+      </w:r>
+      <w:proofErr w:type="gramStart"/>
+      <w:r>
+        <w:t>oficio</w:t>
       </w:r>
       <w:proofErr w:type="spellEnd"/>
+      <w:proofErr w:type="gramEnd"/>
       <w:r>
         <w:t>]]</w:t>
       </w:r>
@@ -3803,18 +3832,18 @@
 </file>
 
 <file path=customXml/item1.xml><?xml version="1.0" encoding="utf-8"?>
-<p:properties xmlns:p="http://schemas.microsoft.com/office/2006/metadata/properties" xmlns:xsi="http://www.w3.org/2001/XMLSchema-instance" xmlns:pc="http://schemas.microsoft.com/office/infopath/2007/PartnerControls">
-  <documentManagement/>
-</p:properties>
-</file>
-
-<file path=customXml/item2.xml><?xml version="1.0" encoding="utf-8"?>
 <?mso-contentType ?>
 <FormTemplates xmlns="http://schemas.microsoft.com/sharepoint/v3/contenttype/forms">
   <Display>DocumentLibraryForm</Display>
   <Edit>DocumentLibraryForm</Edit>
   <New>DocumentLibraryForm</New>
 </FormTemplates>
+</file>
+
+<file path=customXml/item2.xml><?xml version="1.0" encoding="utf-8"?>
+<p:properties xmlns:p="http://schemas.microsoft.com/office/2006/metadata/properties" xmlns:xsi="http://www.w3.org/2001/XMLSchema-instance" xmlns:pc="http://schemas.microsoft.com/office/infopath/2007/PartnerControls">
+  <documentManagement/>
+</p:properties>
 </file>
 
 <file path=customXml/item3.xml><?xml version="1.0" encoding="utf-8"?>
@@ -3956,18 +3985,18 @@
 </file>
 
 <file path=customXml/itemProps1.xml><?xml version="1.0" encoding="utf-8"?>
-<ds:datastoreItem xmlns:ds="http://schemas.openxmlformats.org/officeDocument/2006/customXml" ds:itemID="{3A9EA4BE-E3B6-49A8-A8A7-D32E618C1B96}">
+<ds:datastoreItem xmlns:ds="http://schemas.openxmlformats.org/officeDocument/2006/customXml" ds:itemID="{15487310-0DAD-4EC5-8B46-2B5D03BA84E1}">
   <ds:schemaRefs>
-    <ds:schemaRef ds:uri="http://schemas.microsoft.com/office/2006/metadata/properties"/>
-    <ds:schemaRef ds:uri="http://schemas.microsoft.com/office/infopath/2007/PartnerControls"/>
+    <ds:schemaRef ds:uri="http://schemas.microsoft.com/sharepoint/v3/contenttype/forms"/>
   </ds:schemaRefs>
 </ds:datastoreItem>
 </file>
 
 <file path=customXml/itemProps2.xml><?xml version="1.0" encoding="utf-8"?>
-<ds:datastoreItem xmlns:ds="http://schemas.openxmlformats.org/officeDocument/2006/customXml" ds:itemID="{15487310-0DAD-4EC5-8B46-2B5D03BA84E1}">
+<ds:datastoreItem xmlns:ds="http://schemas.openxmlformats.org/officeDocument/2006/customXml" ds:itemID="{3A9EA4BE-E3B6-49A8-A8A7-D32E618C1B96}">
   <ds:schemaRefs>
-    <ds:schemaRef ds:uri="http://schemas.microsoft.com/sharepoint/v3/contenttype/forms"/>
+    <ds:schemaRef ds:uri="http://schemas.microsoft.com/office/2006/metadata/properties"/>
+    <ds:schemaRef ds:uri="http://schemas.microsoft.com/office/infopath/2007/PartnerControls"/>
   </ds:schemaRefs>
 </ds:datastoreItem>
 </file>

</xml_diff>